<commit_message>
fixed not working microprocessor
</commit_message>
<xml_diff>
--- a/src/y2/s2/cptr_org_asm/project/cptr_org_project.docx
+++ b/src/y2/s2/cptr_org_asm/project/cptr_org_project.docx
@@ -1744,25 +1744,7 @@
           <w:sz w:val="24"/>
           <w:szCs w:val="24"/>
         </w:rPr>
-        <w:t xml:space="preserve">4_17_Brainless microprocessor with </w:t>
-      </w:r>
-      <w:proofErr w:type="spellStart"/>
-      <w:r>
-        <w:rPr>
-          <w:rFonts w:asciiTheme="majorBidi" w:hAnsiTheme="majorBidi" w:cstheme="majorBidi"/>
-          <w:sz w:val="24"/>
-          <w:szCs w:val="24"/>
-        </w:rPr>
-        <w:t>display_control</w:t>
-      </w:r>
-      <w:proofErr w:type="spellEnd"/>
-      <w:r>
-        <w:rPr>
-          <w:rFonts w:asciiTheme="majorBidi" w:hAnsiTheme="majorBidi" w:cstheme="majorBidi"/>
-          <w:sz w:val="24"/>
-          <w:szCs w:val="24"/>
-        </w:rPr>
-        <w:t xml:space="preserve"> panel</w:t>
+        <w:t>4_17_Brainless microprocessor with display_control panel</w:t>
       </w:r>
     </w:p>
     <w:p>
@@ -1779,10 +1761,10 @@
           <w:noProof/>
         </w:rPr>
         <w:drawing>
-          <wp:inline distT="0" distB="0" distL="0" distR="0" wp14:anchorId="2F091186" wp14:editId="5F7AF670">
+          <wp:inline distT="0" distB="0" distL="0" distR="0" wp14:anchorId="3F1F61DC" wp14:editId="1B7632AD">
             <wp:extent cx="9144000" cy="5514340"/>
             <wp:effectExtent l="0" t="0" r="0" b="0"/>
-            <wp:docPr id="1026997796" name="Picture 31" descr="A diagram of a building&#10;&#10;Description automatically generated"/>
+            <wp:docPr id="263508019" name="Picture 1"/>
             <wp:cNvGraphicFramePr>
               <a:graphicFrameLocks xmlns:a="http://schemas.openxmlformats.org/drawingml/2006/main" noChangeAspect="1"/>
             </wp:cNvGraphicFramePr>
@@ -1790,7 +1772,7 @@
               <a:graphicData uri="http://schemas.openxmlformats.org/drawingml/2006/picture">
                 <pic:pic xmlns:pic="http://schemas.openxmlformats.org/drawingml/2006/picture">
                   <pic:nvPicPr>
-                    <pic:cNvPr id="1026997796" name="Picture 31" descr="A diagram of a building&#10;&#10;Description automatically generated"/>
+                    <pic:cNvPr id="0" name="Picture 1"/>
                     <pic:cNvPicPr>
                       <a:picLocks noChangeAspect="1" noChangeArrowheads="1"/>
                     </pic:cNvPicPr>
@@ -2005,18 +1987,8 @@
           <w:sz w:val="24"/>
           <w:szCs w:val="24"/>
         </w:rPr>
-        <w:t xml:space="preserve">5_4_Memory address generation </w:t>
-      </w:r>
-      <w:proofErr w:type="spellStart"/>
-      <w:r>
-        <w:rPr>
-          <w:rFonts w:asciiTheme="majorBidi" w:hAnsiTheme="majorBidi" w:cstheme="majorBidi"/>
-          <w:sz w:val="24"/>
-          <w:szCs w:val="24"/>
-        </w:rPr>
-        <w:t>circuit_TESTING</w:t>
-      </w:r>
-      <w:proofErr w:type="spellEnd"/>
+        <w:t>5_4_Memory address generation circuit_TESTING</w:t>
+      </w:r>
     </w:p>
     <w:p>
       <w:pPr>
@@ -2032,10 +2004,10 @@
           <w:noProof/>
         </w:rPr>
         <w:drawing>
-          <wp:inline distT="0" distB="0" distL="0" distR="0" wp14:anchorId="4FEA563C" wp14:editId="3E9ECB29">
+          <wp:inline distT="0" distB="0" distL="0" distR="0" wp14:anchorId="01146C4D" wp14:editId="51095784">
             <wp:extent cx="9144000" cy="5577840"/>
             <wp:effectExtent l="0" t="0" r="0" b="3810"/>
-            <wp:docPr id="1509119389" name="Picture 36" descr="A diagram of a circuit&#10;&#10;Description automatically generated"/>
+            <wp:docPr id="977882258" name="Picture 2"/>
             <wp:cNvGraphicFramePr>
               <a:graphicFrameLocks xmlns:a="http://schemas.openxmlformats.org/drawingml/2006/main" noChangeAspect="1"/>
             </wp:cNvGraphicFramePr>
@@ -2043,7 +2015,7 @@
               <a:graphicData uri="http://schemas.openxmlformats.org/drawingml/2006/picture">
                 <pic:pic xmlns:pic="http://schemas.openxmlformats.org/drawingml/2006/picture">
                   <pic:nvPicPr>
-                    <pic:cNvPr id="1509119389" name="Picture 36" descr="A diagram of a circuit&#10;&#10;Description automatically generated"/>
+                    <pic:cNvPr id="0" name="Picture 3"/>
                     <pic:cNvPicPr>
                       <a:picLocks noChangeAspect="1" noChangeArrowheads="1"/>
                     </pic:cNvPicPr>
@@ -2189,7 +2161,6 @@
           <w:szCs w:val="24"/>
         </w:rPr>
       </w:pPr>
-      <w:proofErr w:type="spellStart"/>
       <w:r>
         <w:rPr>
           <w:rFonts w:asciiTheme="majorBidi" w:hAnsiTheme="majorBidi" w:cstheme="majorBidi"/>
@@ -2198,7 +2169,6 @@
         </w:rPr>
         <w:t>PROM.hex</w:t>
       </w:r>
-      <w:proofErr w:type="spellEnd"/>
     </w:p>
     <w:p>
       <w:pPr>
@@ -2350,18 +2320,8 @@
           <w:sz w:val="24"/>
           <w:szCs w:val="24"/>
         </w:rPr>
-        <w:t xml:space="preserve">5_10_Microprocessor controller </w:t>
-      </w:r>
-      <w:proofErr w:type="spellStart"/>
-      <w:r>
-        <w:rPr>
-          <w:rFonts w:asciiTheme="majorBidi" w:hAnsiTheme="majorBidi" w:cstheme="majorBidi"/>
-          <w:sz w:val="24"/>
-          <w:szCs w:val="24"/>
-        </w:rPr>
-        <w:t>circuit_TESTING</w:t>
-      </w:r>
-      <w:proofErr w:type="spellEnd"/>
+        <w:t>5_10_Microprocessor controller circuit_TESTING</w:t>
+      </w:r>
     </w:p>
     <w:p>
       <w:pPr>
@@ -2458,10 +2418,10 @@
           <w:noProof/>
         </w:rPr>
         <w:drawing>
-          <wp:inline distT="0" distB="0" distL="0" distR="0" wp14:anchorId="35841884" wp14:editId="7E15E50D">
+          <wp:inline distT="0" distB="0" distL="0" distR="0" wp14:anchorId="20E53C2B" wp14:editId="79BC6EFC">
             <wp:extent cx="9144000" cy="5949950"/>
             <wp:effectExtent l="0" t="0" r="0" b="0"/>
-            <wp:docPr id="761356339" name="Picture 40" descr="A diagram of a circuit&#10;&#10;Description automatically generated"/>
+            <wp:docPr id="1658447274" name="Picture 3"/>
             <wp:cNvGraphicFramePr>
               <a:graphicFrameLocks xmlns:a="http://schemas.openxmlformats.org/drawingml/2006/main" noChangeAspect="1"/>
             </wp:cNvGraphicFramePr>
@@ -2469,7 +2429,7 @@
               <a:graphicData uri="http://schemas.openxmlformats.org/drawingml/2006/picture">
                 <pic:pic xmlns:pic="http://schemas.openxmlformats.org/drawingml/2006/picture">
                   <pic:nvPicPr>
-                    <pic:cNvPr id="761356339" name="Picture 40" descr="A diagram of a circuit&#10;&#10;Description automatically generated"/>
+                    <pic:cNvPr id="0" name="Picture 5"/>
                     <pic:cNvPicPr>
                       <a:picLocks noChangeAspect="1" noChangeArrowheads="1"/>
                     </pic:cNvPicPr>

</xml_diff>